<commit_message>
Fix class counts: the train csv gives 97 verbs, 289 nouns, 3568 actions
Co-Authored-By: Claude Opus 5.5 <noreply@anthropic.com>
Claude-Session: https://claude.ai/code/session_015wtUfx38MSSdWk4aGJhDuk
</commit_message>
<xml_diff>
--- a/docs/BaoCao_VJEPA2_EK100.docx
+++ b/docs/BaoCao_VJEPA2_EK100.docx
@@ -1425,7 +1425,7 @@
                 <w:sz w:val="19"/>
                 <w:szCs w:val="19"/>
               </w:rPr>
-              <w:t xml:space="preserve">Mỗi hành động gồm động từ (verb, ví dụ "cắt") và danh từ (noun, ví dụ "hành tây"). Action là cặp (verb, noun). Có 97 verb, 300 noun và 3806 action trong tập train.</w:t>
+              <w:t xml:space="preserve">Mỗi hành động gồm động từ (verb, ví dụ "cắt") và danh từ (noun, ví dụ "hành tây"). Action là cặp (verb, noun). Có 97 verb, 289 noun và 3568 action trong tập train.</w:t>
             </w:r>
           </w:p>
         </w:tc>
@@ -3011,7 +3011,7 @@
         <w:spacing w:after="60"/>
       </w:pPr>
       <w:r>
-        <w:t xml:space="preserve">Probe nhận cả token encoder và token dự đoán, cho ra logit của 97 verb, 300 noun và 3806 action.</w:t>
+        <w:t xml:space="preserve">Probe nhận cả token encoder và token dự đoán, cho ra logit của 97 verb, 289 noun và 3568 action.</w:t>
       </w:r>
     </w:p>
     <w:p>

</xml_diff>